<commit_message>
Portable: trim pyarrow too (Streamlit pulls it back in); zip 107 -> 75 MB
Co-Authored-By: Claude Fable 5.1 <noreply@anthropic.com>
</commit_message>
<xml_diff>
--- a/docs/MANUAL_TECNICO.docx
+++ b/docs/MANUAL_TECNICO.docx
@@ -15344,6 +15344,16 @@
       </w:pPr>
       <w:r>
         <w:t xml:space="preserve">Recorta lo que el visor no carga: tests, cabeceras C, </w:t>
+      </w:r>
+      <w:r>
+        <w:rPr>
+          <w:rFonts w:ascii="Consolas" w:hAnsi="Consolas"/>
+          <w:sz w:val="18"/>
+        </w:rPr>
+        <w:t>pyarrow</w:t>
+      </w:r>
+      <w:r>
+        <w:t xml:space="preserve">, </w:t>
       </w:r>
       <w:r>
         <w:rPr>

</xml_diff>

<commit_message>
Shared-folder data channel (SharePoint/OneDrive), viewer config file, delivery package
- informe_regional.toml gains [publicacion] carpeta and [tablero]
  carpeta_actualizacion / url_actualizacion; the portable bundle ships
  app/informe_regional.toml editable without rebuilding.
- publicar_datos.py publishes to the shared folder and/or GitHub; an empty
  setting now switches a channel off (settings._get).
- data.py checks the shared folder read-only, then the URL; nine offline
  scenarios verified.
- tools/build_entrega.py: source zip, manuals, portable zip, historical parquet.
- Manuals: SharePoint publication, delivery package, install from source.

Co-Authored-By: Claude Fable 5.1 <noreply@anthropic.com>
</commit_message>
<xml_diff>
--- a/docs/MANUAL_TECNICO.docx
+++ b/docs/MANUAL_TECNICO.docx
@@ -1030,6 +1030,14 @@
           <w:sz w:val="17"/>
         </w:rPr>
         <w:t>│   ├── build_docs.py              genera los .docx de los manuales</w:t>
+        <w:br/>
+      </w:r>
+      <w:r>
+        <w:rPr>
+          <w:rFonts w:ascii="Consolas" w:hAnsi="Consolas"/>
+          <w:sz w:val="17"/>
+        </w:rPr>
+        <w:t>│   ├── build_entrega.py           paquete de entrega (código, manuales, tablero, datos)</w:t>
         <w:br/>
       </w:r>
       <w:r>
@@ -1997,6 +2005,96 @@
                 <w:rFonts w:ascii="Consolas" w:hAnsi="Consolas"/>
                 <w:sz w:val="18"/>
               </w:rPr>
+              <w:t>[publicacion] carpeta</w:t>
+            </w:r>
+          </w:p>
+        </w:tc>
+        <w:tc>
+          <w:tcPr>
+            <w:tcW w:type="dxa" w:w="2160"/>
+          </w:tcPr>
+          <w:p>
+            <w:r>
+              <w:rPr>
+                <w:sz w:val="18"/>
+              </w:rPr>
+            </w:r>
+            <w:r>
+              <w:rPr>
+                <w:rFonts w:ascii="Consolas" w:hAnsi="Consolas"/>
+                <w:sz w:val="18"/>
+              </w:rPr>
+              <w:t>INFORME_PUBLICACION_DIR</w:t>
+            </w:r>
+          </w:p>
+        </w:tc>
+        <w:tc>
+          <w:tcPr>
+            <w:tcW w:type="dxa" w:w="2160"/>
+          </w:tcPr>
+          <w:p>
+            <w:r>
+              <w:rPr>
+                <w:sz w:val="18"/>
+              </w:rPr>
+            </w:r>
+            <w:r>
+              <w:rPr>
+                <w:rFonts w:ascii="Consolas" w:hAnsi="Consolas"/>
+                <w:sz w:val="18"/>
+              </w:rPr>
+              <w:t>""</w:t>
+            </w:r>
+            <w:r>
+              <w:rPr>
+                <w:sz w:val="18"/>
+              </w:rPr>
+              <w:t xml:space="preserve"> (desactivado)</w:t>
+            </w:r>
+          </w:p>
+        </w:tc>
+        <w:tc>
+          <w:tcPr>
+            <w:tcW w:type="dxa" w:w="2160"/>
+          </w:tcPr>
+          <w:p>
+            <w:r>
+              <w:rPr>
+                <w:sz w:val="18"/>
+              </w:rPr>
+            </w:r>
+            <w:r>
+              <w:rPr>
+                <w:sz w:val="18"/>
+              </w:rPr>
+              <w:t xml:space="preserve">Carpeta compartida (SharePoint sincronizado, unidad de red) donde se copia cada mes la base del visor. </w:t>
+            </w:r>
+            <w:r>
+              <w:rPr>
+                <w:b/>
+                <w:sz w:val="18"/>
+              </w:rPr>
+              <w:t>Canal recomendado dentro de la organización</w:t>
+            </w:r>
+          </w:p>
+        </w:tc>
+      </w:tr>
+      <w:tr>
+        <w:tc>
+          <w:tcPr>
+            <w:tcW w:type="dxa" w:w="2160"/>
+          </w:tcPr>
+          <w:p>
+            <w:r>
+              <w:rPr>
+                <w:sz w:val="18"/>
+              </w:rPr>
+            </w:r>
+            <w:r>
+              <w:rPr>
+                <w:rFonts w:ascii="Consolas" w:hAnsi="Consolas"/>
+                <w:sz w:val="18"/>
+              </w:rPr>
               <w:t>[publicacion] repo</w:t>
             </w:r>
           </w:p>
@@ -2053,7 +2151,212 @@
               <w:rPr>
                 <w:sz w:val="18"/>
               </w:rPr>
-              <w:t>Repositorio cuyas releases llevan la base mensual</w:t>
+              <w:t xml:space="preserve">Repositorio de GitHub con la release pública </w:t>
+            </w:r>
+            <w:r>
+              <w:rPr>
+                <w:rFonts w:ascii="Consolas" w:hAnsi="Consolas"/>
+                <w:sz w:val="18"/>
+              </w:rPr>
+              <w:t>datos-&lt;versión&gt;</w:t>
+            </w:r>
+            <w:r>
+              <w:rPr>
+                <w:sz w:val="18"/>
+              </w:rPr>
+              <w:t xml:space="preserve">; </w:t>
+            </w:r>
+            <w:r>
+              <w:rPr>
+                <w:rFonts w:ascii="Consolas" w:hAnsi="Consolas"/>
+                <w:sz w:val="18"/>
+              </w:rPr>
+              <w:t>""</w:t>
+            </w:r>
+            <w:r>
+              <w:rPr>
+                <w:sz w:val="18"/>
+              </w:rPr>
+              <w:t xml:space="preserve"> desactiva este canal</w:t>
+            </w:r>
+          </w:p>
+        </w:tc>
+      </w:tr>
+      <w:tr>
+        <w:tc>
+          <w:tcPr>
+            <w:tcW w:type="dxa" w:w="2160"/>
+          </w:tcPr>
+          <w:p>
+            <w:r>
+              <w:rPr>
+                <w:sz w:val="18"/>
+              </w:rPr>
+            </w:r>
+            <w:r>
+              <w:rPr>
+                <w:rFonts w:ascii="Consolas" w:hAnsi="Consolas"/>
+                <w:sz w:val="18"/>
+              </w:rPr>
+              <w:t>[tablero] carpeta_actualizacion</w:t>
+            </w:r>
+          </w:p>
+        </w:tc>
+        <w:tc>
+          <w:tcPr>
+            <w:tcW w:type="dxa" w:w="2160"/>
+          </w:tcPr>
+          <w:p>
+            <w:r>
+              <w:rPr>
+                <w:sz w:val="18"/>
+              </w:rPr>
+            </w:r>
+            <w:r>
+              <w:rPr>
+                <w:rFonts w:ascii="Consolas" w:hAnsi="Consolas"/>
+                <w:sz w:val="18"/>
+              </w:rPr>
+              <w:t>INFORME_UPDATE_DIR</w:t>
+            </w:r>
+          </w:p>
+        </w:tc>
+        <w:tc>
+          <w:tcPr>
+            <w:tcW w:type="dxa" w:w="2160"/>
+          </w:tcPr>
+          <w:p>
+            <w:r>
+              <w:rPr>
+                <w:sz w:val="18"/>
+              </w:rPr>
+            </w:r>
+            <w:r>
+              <w:rPr>
+                <w:rFonts w:ascii="Consolas" w:hAnsi="Consolas"/>
+                <w:sz w:val="18"/>
+              </w:rPr>
+              <w:t>""</w:t>
+            </w:r>
+          </w:p>
+        </w:tc>
+        <w:tc>
+          <w:tcPr>
+            <w:tcW w:type="dxa" w:w="2160"/>
+          </w:tcPr>
+          <w:p>
+            <w:r>
+              <w:rPr>
+                <w:sz w:val="18"/>
+              </w:rPr>
+            </w:r>
+            <w:r>
+              <w:rPr>
+                <w:sz w:val="18"/>
+              </w:rPr>
+              <w:t>(Tablero) la misma carpeta compartida, vista desde el equipo del usuario</w:t>
+            </w:r>
+          </w:p>
+        </w:tc>
+      </w:tr>
+      <w:tr>
+        <w:tc>
+          <w:tcPr>
+            <w:tcW w:type="dxa" w:w="2160"/>
+          </w:tcPr>
+          <w:p>
+            <w:r>
+              <w:rPr>
+                <w:sz w:val="18"/>
+              </w:rPr>
+            </w:r>
+            <w:r>
+              <w:rPr>
+                <w:rFonts w:ascii="Consolas" w:hAnsi="Consolas"/>
+                <w:sz w:val="18"/>
+              </w:rPr>
+              <w:t>[tablero] url_actualizacion</w:t>
+            </w:r>
+          </w:p>
+        </w:tc>
+        <w:tc>
+          <w:tcPr>
+            <w:tcW w:type="dxa" w:w="2160"/>
+          </w:tcPr>
+          <w:p>
+            <w:r>
+              <w:rPr>
+                <w:sz w:val="18"/>
+              </w:rPr>
+            </w:r>
+            <w:r>
+              <w:rPr>
+                <w:rFonts w:ascii="Consolas" w:hAnsi="Consolas"/>
+                <w:sz w:val="18"/>
+              </w:rPr>
+              <w:t>INFORME_RELEASE_URL</w:t>
+            </w:r>
+          </w:p>
+        </w:tc>
+        <w:tc>
+          <w:tcPr>
+            <w:tcW w:type="dxa" w:w="2160"/>
+          </w:tcPr>
+          <w:p>
+            <w:r>
+              <w:rPr>
+                <w:sz w:val="18"/>
+              </w:rPr>
+            </w:r>
+            <w:r>
+              <w:rPr>
+                <w:sz w:val="18"/>
+              </w:rPr>
+              <w:t>release *latest* del repositorio</w:t>
+            </w:r>
+          </w:p>
+        </w:tc>
+        <w:tc>
+          <w:tcPr>
+            <w:tcW w:type="dxa" w:w="2160"/>
+          </w:tcPr>
+          <w:p>
+            <w:r>
+              <w:rPr>
+                <w:sz w:val="18"/>
+              </w:rPr>
+            </w:r>
+            <w:r>
+              <w:rPr>
+                <w:sz w:val="18"/>
+              </w:rPr>
+              <w:t xml:space="preserve">(Tablero) URL base con </w:t>
+            </w:r>
+            <w:r>
+              <w:rPr>
+                <w:rFonts w:ascii="Consolas" w:hAnsi="Consolas"/>
+                <w:sz w:val="18"/>
+              </w:rPr>
+              <w:t>manifest.json</w:t>
+            </w:r>
+            <w:r>
+              <w:rPr>
+                <w:sz w:val="18"/>
+              </w:rPr>
+              <w:t xml:space="preserve"> y la base; </w:t>
+            </w:r>
+            <w:r>
+              <w:rPr>
+                <w:rFonts w:ascii="Consolas" w:hAnsi="Consolas"/>
+                <w:sz w:val="18"/>
+              </w:rPr>
+              <w:t>""</w:t>
+            </w:r>
+            <w:r>
+              <w:rPr>
+                <w:sz w:val="18"/>
+              </w:rPr>
+              <w:t xml:space="preserve"> desactiva la descarga</w:t>
             </w:r>
           </w:p>
         </w:tc>
@@ -2062,6 +2365,19 @@
     <w:p/>
     <w:p>
       <w:r>
+        <w:t>Un valor vacío (</w:t>
+      </w:r>
+      <w:r>
+        <w:rPr>
+          <w:rFonts w:ascii="Consolas" w:hAnsi="Consolas"/>
+          <w:sz w:val="18"/>
+        </w:rPr>
+        <w:t>""</w:t>
+      </w:r>
+      <w:r>
+        <w:t xml:space="preserve">) es un valor explícito y desactiva el canal; solo una clave ausente usa el valor por defecto. </w:t>
+      </w:r>
+      <w:r>
         <w:rPr>
           <w:rFonts w:ascii="Consolas" w:hAnsi="Consolas"/>
           <w:sz w:val="18"/>
@@ -2104,7 +2420,27 @@
     </w:p>
     <w:p>
       <w:r>
-        <w:t>El tablero tiene sus propias variables (sección 7.3).</w:t>
+        <w:t xml:space="preserve">El tablero lee la sección </w:t>
+      </w:r>
+      <w:r>
+        <w:rPr>
+          <w:rFonts w:ascii="Consolas" w:hAnsi="Consolas"/>
+          <w:sz w:val="18"/>
+        </w:rPr>
+        <w:t>[tablero]</w:t>
+      </w:r>
+      <w:r>
+        <w:t xml:space="preserve"> del mismo archivo, situado junto a la aplicación: la raíz del repositorio en el equipo del operador, </w:t>
+      </w:r>
+      <w:r>
+        <w:rPr>
+          <w:rFonts w:ascii="Consolas" w:hAnsi="Consolas"/>
+          <w:sz w:val="18"/>
+        </w:rPr>
+        <w:t>app\informe_regional.toml</w:t>
+      </w:r>
+      <w:r>
+        <w:t xml:space="preserve"> en la versión portable (sección 7.3).</w:t>
       </w:r>
     </w:p>
     <w:p>
@@ -3150,7 +3486,7 @@
         <w:t>publicar_datos.py</w:t>
       </w:r>
       <w:r>
-        <w:t xml:space="preserve"> muestra repositorio, versión y tamaño y pide confirmación; con </w:t>
+        <w:t xml:space="preserve"> verifica el SHA-256 de la base exportada, muestra versión, tamaño y canales, y pide confirmación (con </w:t>
       </w:r>
       <w:r>
         <w:rPr>
@@ -3160,17 +3496,110 @@
         <w:t>--si</w:t>
       </w:r>
       <w:r>
-        <w:t xml:space="preserve"> no pregunta (uso programado). Crea la release pública </w:t>
+        <w:t xml:space="preserve"> no pregunta; uso programado). Según </w:t>
       </w:r>
       <w:r>
         <w:rPr>
           <w:rFonts w:ascii="Consolas" w:hAnsi="Consolas"/>
           <w:sz w:val="18"/>
         </w:rPr>
+        <w:t>[publicacion]</w:t>
+      </w:r>
+      <w:r>
+        <w:t>:</w:t>
+      </w:r>
+    </w:p>
+    <w:p>
+      <w:pPr>
+        <w:pStyle w:val="ListBullet"/>
+      </w:pPr>
+      <w:r>
+        <w:rPr>
+          <w:b/>
+        </w:rPr>
+        <w:t>Carpeta compartida</w:t>
+      </w:r>
+      <w:r>
+        <w:t xml:space="preserve"> (</w:t>
+      </w:r>
+      <w:r>
+        <w:rPr>
+          <w:rFonts w:ascii="Consolas" w:hAnsi="Consolas"/>
+          <w:sz w:val="18"/>
+        </w:rPr>
+        <w:t>carpeta</w:t>
+      </w:r>
+      <w:r>
+        <w:t xml:space="preserve">): copia la base (primero a </w:t>
+      </w:r>
+      <w:r>
+        <w:rPr>
+          <w:rFonts w:ascii="Consolas" w:hAnsi="Consolas"/>
+          <w:sz w:val="18"/>
+        </w:rPr>
+        <w:t>.part</w:t>
+      </w:r>
+      <w:r>
+        <w:t xml:space="preserve">, luego renombrado atómico) y después </w:t>
+      </w:r>
+      <w:r>
+        <w:rPr>
+          <w:rFonts w:ascii="Consolas" w:hAnsi="Consolas"/>
+          <w:sz w:val="18"/>
+        </w:rPr>
+        <w:t>manifest.json</w:t>
+      </w:r>
+      <w:r>
+        <w:t xml:space="preserve"> a la carpeta. Si la carpeta es una biblioteca de SharePoint sincronizada con OneDrive, cada tablero configurado con esa misma biblioteca instala la versión nueva al abrirse. No requiere GitHub ni salida a internet.</w:t>
+      </w:r>
+    </w:p>
+    <w:p>
+      <w:pPr>
+        <w:pStyle w:val="ListBullet"/>
+      </w:pPr>
+      <w:r>
+        <w:rPr>
+          <w:b/>
+        </w:rPr>
+        <w:t>GitHub</w:t>
+      </w:r>
+      <w:r>
+        <w:t xml:space="preserve"> (</w:t>
+      </w:r>
+      <w:r>
+        <w:rPr>
+          <w:rFonts w:ascii="Consolas" w:hAnsi="Consolas"/>
+          <w:sz w:val="18"/>
+        </w:rPr>
+        <w:t>repo</w:t>
+      </w:r>
+      <w:r>
+        <w:t xml:space="preserve">): crea la release pública </w:t>
+      </w:r>
+      <w:r>
+        <w:rPr>
+          <w:rFonts w:ascii="Consolas" w:hAnsi="Consolas"/>
+          <w:sz w:val="18"/>
+        </w:rPr>
         <w:t>datos-&lt;versión&gt;</w:t>
       </w:r>
       <w:r>
-        <w:t xml:space="preserve"> con la base y el manifiesto y la marca como *latest*. Desde ese momento todos los tableros se actualizan al abrirse.</w:t>
+        <w:t xml:space="preserve"> con los dos archivos y la marca como *latest*; los tableros con </w:t>
+      </w:r>
+      <w:r>
+        <w:rPr>
+          <w:rFonts w:ascii="Consolas" w:hAnsi="Consolas"/>
+          <w:sz w:val="18"/>
+        </w:rPr>
+        <w:t>url_actualizacion</w:t>
+      </w:r>
+      <w:r>
+        <w:t xml:space="preserve"> apuntando a ese repositorio la descargan.</w:t>
+      </w:r>
+    </w:p>
+    <w:p>
+      <w:r>
+        <w:t>Se pueden usar los dos canales a la vez. Con ninguno configurado el script se niega a continuar.</w:t>
       </w:r>
     </w:p>
     <w:p>
@@ -14844,7 +15273,7 @@
         <w:t>app/data/</w:t>
       </w:r>
       <w:r>
-        <w:t>), que se actualiza al abrir la aplicación y cada 6 horas si sigue abierta:</w:t>
+        <w:t>), que se actualiza al abrir la aplicación y cada 6 horas si sigue abierta, consultando en este orden:</w:t>
       </w:r>
     </w:p>
     <w:p>
@@ -14855,50 +15284,50 @@
         <w:rPr>
           <w:b/>
         </w:rPr>
-        <w:t>A (manual):</w:t>
-      </w:r>
-      <w:r>
-        <w:t xml:space="preserve"> cualquier </w:t>
+        <w:t>A1, carpeta propia</w:t>
+      </w:r>
+      <w:r>
+        <w:t xml:space="preserve"> </w:t>
       </w:r>
       <w:r>
         <w:rPr>
           <w:rFonts w:ascii="Consolas" w:hAnsi="Consolas"/>
           <w:sz w:val="18"/>
         </w:rPr>
+        <w:t>data/actualizacion/</w:t>
+      </w:r>
+      <w:r>
+        <w:t xml:space="preserve">: cualquier </w:t>
+      </w:r>
+      <w:r>
+        <w:rPr>
+          <w:rFonts w:ascii="Consolas" w:hAnsi="Consolas"/>
+          <w:sz w:val="18"/>
+        </w:rPr>
         <w:t>*.duckdb</w:t>
       </w:r>
       <w:r>
-        <w:t xml:space="preserve"> en </w:t>
+        <w:t xml:space="preserve"> que sea una base del visor con versión mayor se instala (copia a </w:t>
       </w:r>
       <w:r>
         <w:rPr>
           <w:rFonts w:ascii="Consolas" w:hAnsi="Consolas"/>
           <w:sz w:val="18"/>
         </w:rPr>
-        <w:t>data/actualizacion/</w:t>
-      </w:r>
-      <w:r>
-        <w:t xml:space="preserve"> que sea una base del visor con versión mayor se instala (copia a </w:t>
+        <w:t>.part</w:t>
+      </w:r>
+      <w:r>
+        <w:t xml:space="preserve">, verificación, </w:t>
       </w:r>
       <w:r>
         <w:rPr>
           <w:rFonts w:ascii="Consolas" w:hAnsi="Consolas"/>
           <w:sz w:val="18"/>
         </w:rPr>
-        <w:t>.part</w:t>
-      </w:r>
-      <w:r>
-        <w:t xml:space="preserve">, verificación, </w:t>
-      </w:r>
-      <w:r>
-        <w:rPr>
-          <w:rFonts w:ascii="Consolas" w:hAnsi="Consolas"/>
-          <w:sz w:val="18"/>
-        </w:rPr>
         <w:t>os.replace</w:t>
       </w:r>
       <w:r>
-        <w:t xml:space="preserve"> atómico) y se borra de la carpeta. Un archivo válido pero no más nuevo también se borra; uno que no es una base se deja.</w:t>
+        <w:t xml:space="preserve"> atómico). Los archivos de esa carpeta que son bases del visor se borran tras mirarlos, sean nuevos o no; lo que no es una base se deja.</w:t>
       </w:r>
     </w:p>
     <w:p>
@@ -14909,49 +15338,29 @@
         <w:rPr>
           <w:b/>
         </w:rPr>
-        <w:t>B (automático):</w:t>
-      </w:r>
-      <w:r>
-        <w:t xml:space="preserve"> descarga </w:t>
+        <w:t>A2, carpeta compartida</w:t>
+      </w:r>
+      <w:r>
+        <w:t xml:space="preserve"> (</w:t>
       </w:r>
       <w:r>
         <w:rPr>
           <w:rFonts w:ascii="Consolas" w:hAnsi="Consolas"/>
           <w:sz w:val="18"/>
         </w:rPr>
-        <w:t>manifest.json</w:t>
-      </w:r>
-      <w:r>
-        <w:t xml:space="preserve"> de </w:t>
-      </w:r>
-      <w:r>
-        <w:rPr>
-          <w:rFonts w:ascii="Consolas" w:hAnsi="Consolas"/>
-          <w:sz w:val="18"/>
-        </w:rPr>
-        <w:t>INFORME_RELEASE_URL</w:t>
-      </w:r>
-      <w:r>
-        <w:t xml:space="preserve"> (por defecto </w:t>
-      </w:r>
-      <w:r>
-        <w:rPr>
-          <w:rFonts w:ascii="Consolas" w:hAnsi="Consolas"/>
-          <w:sz w:val="18"/>
-        </w:rPr>
-        <w:t>https://github.com/&lt;INFORME_GITHUB_REPO&gt;/releases/latest/download</w:t>
-      </w:r>
-      <w:r>
-        <w:t xml:space="preserve">; tiempo máximo 8 s); si la versión publicada es mayor, descarga la base por bloques, comprueba el </w:t>
+        <w:t>[tablero] carpeta_actualizacion</w:t>
+      </w:r>
+      <w:r>
+        <w:t xml:space="preserve">, p. ej. la biblioteca de SharePoint sincronizada con OneDrive donde publica el operador): igual, pero </w:t>
       </w:r>
       <w:r>
         <w:rPr>
           <w:b/>
         </w:rPr>
-        <w:t>SHA-256</w:t>
-      </w:r>
-      <w:r>
-        <w:t xml:space="preserve"> y la instala.</w:t>
+        <w:t>solo lectura</w:t>
+      </w:r>
+      <w:r>
+        <w:t>: nunca borra ni escribe en ella. Si la carpeta no existe (OneDrive sin sincronizar), se omite.</w:t>
       </w:r>
     </w:p>
     <w:p>
@@ -14959,7 +15368,42 @@
         <w:pStyle w:val="ListBullet2"/>
       </w:pPr>
       <w:r>
-        <w:t>Cualquier fallo (sin internet, GitHub bloqueado, archivo dañado, base bloqueada por otra ventana) deja la copia actual y se informa en la barra lateral ("No se pudo comprobar si hay datos más recientes", con el detalle en el tooltip).</w:t>
+        <w:rPr>
+          <w:b/>
+        </w:rPr>
+        <w:t>B, URL</w:t>
+      </w:r>
+      <w:r>
+        <w:t xml:space="preserve"> (</w:t>
+      </w:r>
+      <w:r>
+        <w:rPr>
+          <w:rFonts w:ascii="Consolas" w:hAnsi="Consolas"/>
+          <w:sz w:val="18"/>
+        </w:rPr>
+        <w:t>[tablero] url_actualizacion</w:t>
+      </w:r>
+      <w:r>
+        <w:t xml:space="preserve">): descarga </w:t>
+      </w:r>
+      <w:r>
+        <w:rPr>
+          <w:rFonts w:ascii="Consolas" w:hAnsi="Consolas"/>
+          <w:sz w:val="18"/>
+        </w:rPr>
+        <w:t>manifest.json</w:t>
+      </w:r>
+      <w:r>
+        <w:t xml:space="preserve"> (tiempo máximo 8 s); si la versión publicada es mayor, descarga la base por bloques, comprueba el </w:t>
+      </w:r>
+      <w:r>
+        <w:rPr>
+          <w:b/>
+        </w:rPr>
+        <w:t>SHA-256</w:t>
+      </w:r>
+      <w:r>
+        <w:t xml:space="preserve"> y la instala.</w:t>
       </w:r>
     </w:p>
     <w:p>
@@ -14967,43 +15411,61 @@
         <w:pStyle w:val="ListBullet2"/>
       </w:pPr>
       <w:r>
-        <w:t>Sin base, o con una base dañada, la página muestra las instrucciones y se detiene.</w:t>
+        <w:t>La versión mayor gana; nunca se instala una versión igual o menor. Cualquier fallo (sin red, URL bloqueada, carpeta sin sincronizar, archivo dañado o a medio copiar, base bloqueada por otra ventana, error de sintaxis en el TOML) deja la copia actual y se informa en la barra lateral ("No se pudo comprobar si hay datos más recientes", con el detalle en el tooltip).</w:t>
       </w:r>
     </w:p>
     <w:p>
-      <w:r>
-        <w:t xml:space="preserve">Las funciones cacheadas no dibujan elementos de Streamlit (lo harían en cada acierto de caché); el resultado de la comprobación queda en </w:t>
-      </w:r>
-      <w:r>
-        <w:rPr>
-          <w:rFonts w:ascii="Consolas" w:hAnsi="Consolas"/>
-          <w:sz w:val="18"/>
-        </w:rPr>
-        <w:t>_STATUS</w:t>
-      </w:r>
-      <w:r>
-        <w:t xml:space="preserve"> y </w:t>
-      </w:r>
-      <w:r>
-        <w:rPr>
-          <w:rFonts w:ascii="Consolas" w:hAnsi="Consolas"/>
-          <w:sz w:val="18"/>
-        </w:rPr>
-        <w:t>app.py</w:t>
-      </w:r>
-      <w:r>
-        <w:t xml:space="preserve"> muestra el aviso una vez por sesión.</w:t>
+      <w:pPr>
+        <w:pStyle w:val="ListBullet2"/>
+      </w:pPr>
+      <w:r>
+        <w:t>Sin base, o con una base dañada, la página muestra las instrucciones y se detiene.</w:t>
       </w:r>
     </w:p>
     <w:p>
       <w:r>
-        <w:t xml:space="preserve">Variables de entorno del tablero: </w:t>
+        <w:t xml:space="preserve">Las funciones cacheadas no dibujan elementos de Streamlit (lo harían en cada acierto de caché); el resultado de la comprobación queda en </w:t>
       </w:r>
       <w:r>
         <w:rPr>
           <w:rFonts w:ascii="Consolas" w:hAnsi="Consolas"/>
           <w:sz w:val="18"/>
         </w:rPr>
+        <w:t>_STATUS</w:t>
+      </w:r>
+      <w:r>
+        <w:t xml:space="preserve"> y </w:t>
+      </w:r>
+      <w:r>
+        <w:rPr>
+          <w:rFonts w:ascii="Consolas" w:hAnsi="Consolas"/>
+          <w:sz w:val="18"/>
+        </w:rPr>
+        <w:t>app.py</w:t>
+      </w:r>
+      <w:r>
+        <w:t xml:space="preserve"> muestra el aviso una vez por sesión.</w:t>
+      </w:r>
+    </w:p>
+    <w:p>
+      <w:r>
+        <w:t xml:space="preserve">Variables de entorno del tablero (tienen prioridad sobre </w:t>
+      </w:r>
+      <w:r>
+        <w:rPr>
+          <w:rFonts w:ascii="Consolas" w:hAnsi="Consolas"/>
+          <w:sz w:val="18"/>
+        </w:rPr>
+        <w:t>informe_regional.toml</w:t>
+      </w:r>
+      <w:r>
+        <w:t xml:space="preserve">): </w:t>
+      </w:r>
+      <w:r>
+        <w:rPr>
+          <w:rFonts w:ascii="Consolas" w:hAnsi="Consolas"/>
+          <w:sz w:val="18"/>
+        </w:rPr>
         <w:t>INFORME_DB_PATH</w:t>
       </w:r>
       <w:r>
@@ -15024,17 +15486,27 @@
           <w:rFonts w:ascii="Consolas" w:hAnsi="Consolas"/>
           <w:sz w:val="18"/>
         </w:rPr>
+        <w:t>INFORME_UPDATE_DIR</w:t>
+      </w:r>
+      <w:r>
+        <w:t xml:space="preserve">, </w:t>
+      </w:r>
+      <w:r>
+        <w:rPr>
+          <w:rFonts w:ascii="Consolas" w:hAnsi="Consolas"/>
+          <w:sz w:val="18"/>
+        </w:rPr>
+        <w:t>INFORME_RELEASE_URL</w:t>
+      </w:r>
+      <w:r>
+        <w:t xml:space="preserve">, </w:t>
+      </w:r>
+      <w:r>
+        <w:rPr>
+          <w:rFonts w:ascii="Consolas" w:hAnsi="Consolas"/>
+          <w:sz w:val="18"/>
+        </w:rPr>
         <w:t>INFORME_GITHUB_REPO</w:t>
-      </w:r>
-      <w:r>
-        <w:t xml:space="preserve">, </w:t>
-      </w:r>
-      <w:r>
-        <w:rPr>
-          <w:rFonts w:ascii="Consolas" w:hAnsi="Consolas"/>
-          <w:sz w:val="18"/>
-        </w:rPr>
-        <w:t>INFORME_RELEASE_URL</w:t>
       </w:r>
       <w:r>
         <w:t>.</w:t>
@@ -15411,7 +15883,7 @@
         <w:t>data/dist/</w:t>
       </w:r>
       <w:r>
-        <w:t xml:space="preserve"> y crea </w:t>
+        <w:t xml:space="preserve">, el manual de usuario en Word, y crea </w:t>
       </w:r>
       <w:r>
         <w:rPr>
@@ -15421,7 +15893,27 @@
         <w:t>abrir.py</w:t>
       </w:r>
       <w:r>
-        <w:t xml:space="preserve"> (elige el primer puerto libre desde 8765) y los archivos </w:t>
+        <w:t xml:space="preserve"> (elige el primer puerto libre desde 8765), </w:t>
+      </w:r>
+      <w:r>
+        <w:rPr>
+          <w:rFonts w:ascii="Consolas" w:hAnsi="Consolas"/>
+          <w:sz w:val="18"/>
+        </w:rPr>
+        <w:t>app/informe_regional.toml</w:t>
+      </w:r>
+      <w:r>
+        <w:t xml:space="preserve"> (sección </w:t>
+      </w:r>
+      <w:r>
+        <w:rPr>
+          <w:rFonts w:ascii="Consolas" w:hAnsi="Consolas"/>
+          <w:sz w:val="18"/>
+        </w:rPr>
+        <w:t>[tablero]</w:t>
+      </w:r>
+      <w:r>
+        <w:t xml:space="preserve">, editable con el Bloc de notas), </w:t>
       </w:r>
       <w:r>
         <w:rPr>
@@ -15478,6 +15970,14 @@
           <w:rFonts w:ascii="Consolas" w:hAnsi="Consolas"/>
           <w:sz w:val="17"/>
         </w:rPr>
+        <w:t xml:space="preserve">  Manual de usuario.docx</w:t>
+        <w:br/>
+      </w:r>
+      <w:r>
+        <w:rPr>
+          <w:rFonts w:ascii="Consolas" w:hAnsi="Consolas"/>
+          <w:sz w:val="17"/>
+        </w:rPr>
         <w:t xml:space="preserve">  python/                        intérprete + paquetes</w:t>
         <w:br/>
       </w:r>
@@ -15502,6 +16002,14 @@
           <w:rFonts w:ascii="Consolas" w:hAnsi="Consolas"/>
           <w:sz w:val="17"/>
         </w:rPr>
+        <w:t xml:space="preserve">    informe_regional.toml        carpeta compartida y URL de actualización</w:t>
+        <w:br/>
+      </w:r>
+      <w:r>
+        <w:rPr>
+          <w:rFonts w:ascii="Consolas" w:hAnsi="Consolas"/>
+          <w:sz w:val="17"/>
+        </w:rPr>
         <w:t xml:space="preserve">    .streamlit/config.toml</w:t>
         <w:br/>
       </w:r>
@@ -15540,7 +16048,7 @@
         <w:t>código</w:t>
       </w:r>
       <w:r>
-        <w:t xml:space="preserve"> del tablero; los datos llegan solos. Se entrega el zip; el usuario lo descomprime y hace doble clic. No requiere administrador, no modifica el registro ni instala nada.</w:t>
+        <w:t xml:space="preserve"> del tablero; los datos llegan solos. No requiere administrador, no modifica el registro ni instala nada.</w:t>
       </w:r>
     </w:p>
     <w:p>
@@ -15548,7 +16056,12 @@
         <w:pStyle w:val="Heading3"/>
       </w:pPr>
       <w:r>
-        <w:t>8.2 Actualización de datos: protocolo</w:t>
+        <w:t>8.2 Publicación en SharePoint</w:t>
+      </w:r>
+    </w:p>
+    <w:p>
+      <w:r>
+        <w:t>Estructura recomendada en el sitio de SharePoint de la entidad:</w:t>
       </w:r>
     </w:p>
     <w:p>
@@ -15561,7 +16074,268 @@
           <w:rFonts w:ascii="Consolas" w:hAnsi="Consolas"/>
           <w:sz w:val="17"/>
         </w:rPr>
-        <w:t>operador                          GitHub (release "latest")          tablero del usuario</w:t>
+        <w:t>Informe Regional/</w:t>
+        <w:br/>
+      </w:r>
+      <w:r>
+        <w:rPr>
+          <w:rFonts w:ascii="Consolas" w:hAnsi="Consolas"/>
+          <w:sz w:val="17"/>
+        </w:rPr>
+        <w:t xml:space="preserve">  Tablero/     InformeRegional_&lt;versión&gt;.zip, MANUAL_USUARIO.docx</w:t>
+        <w:br/>
+      </w:r>
+      <w:r>
+        <w:rPr>
+          <w:rFonts w:ascii="Consolas" w:hAnsi="Consolas"/>
+          <w:sz w:val="17"/>
+        </w:rPr>
+        <w:t xml:space="preserve">  Datos/       informe_regional_visor.duckdb + manifest.json   (los deja publicar_datos.py cada mes)</w:t>
+      </w:r>
+    </w:p>
+    <w:p>
+      <w:pPr>
+        <w:pStyle w:val="ListNumber"/>
+      </w:pPr>
+      <w:r>
+        <w:rPr>
+          <w:b/>
+        </w:rPr>
+        <w:t>Antes de distribuir</w:t>
+      </w:r>
+      <w:r>
+        <w:t xml:space="preserve">, abrir </w:t>
+      </w:r>
+      <w:r>
+        <w:rPr>
+          <w:rFonts w:ascii="Consolas" w:hAnsi="Consolas"/>
+          <w:sz w:val="18"/>
+        </w:rPr>
+        <w:t>app\informe_regional.toml</w:t>
+      </w:r>
+      <w:r>
+        <w:t xml:space="preserve"> del paquete y escribir en </w:t>
+      </w:r>
+      <w:r>
+        <w:rPr>
+          <w:rFonts w:ascii="Consolas" w:hAnsi="Consolas"/>
+          <w:sz w:val="18"/>
+        </w:rPr>
+        <w:t>carpeta_actualizacion</w:t>
+      </w:r>
+      <w:r>
+        <w:t xml:space="preserve"> la ruta local con la que OneDrive sincroniza </w:t>
+      </w:r>
+      <w:r>
+        <w:rPr>
+          <w:rFonts w:ascii="Consolas" w:hAnsi="Consolas"/>
+          <w:sz w:val="18"/>
+        </w:rPr>
+        <w:t>Datos/</w:t>
+      </w:r>
+      <w:r>
+        <w:t xml:space="preserve"> en los equipos de los usuarios (por ejemplo </w:t>
+      </w:r>
+      <w:r>
+        <w:rPr>
+          <w:rFonts w:ascii="Consolas" w:hAnsi="Consolas"/>
+          <w:sz w:val="18"/>
+        </w:rPr>
+        <w:t>C:/Users/&lt;usuario&gt;/&lt;Entidad&gt;/Informe Regional - Datos</w:t>
+      </w:r>
+      <w:r>
+        <w:t xml:space="preserve">; se admiten </w:t>
+      </w:r>
+      <w:r>
+        <w:rPr>
+          <w:rFonts w:ascii="Consolas" w:hAnsi="Consolas"/>
+          <w:sz w:val="18"/>
+        </w:rPr>
+        <w:t>~</w:t>
+      </w:r>
+      <w:r>
+        <w:t xml:space="preserve"> y variables como </w:t>
+      </w:r>
+      <w:r>
+        <w:rPr>
+          <w:rFonts w:ascii="Consolas" w:hAnsi="Consolas"/>
+          <w:sz w:val="18"/>
+        </w:rPr>
+        <w:t>%OneDrive%</w:t>
+      </w:r>
+      <w:r>
+        <w:t xml:space="preserve">). Si la entidad no usa GitHub, dejar </w:t>
+      </w:r>
+      <w:r>
+        <w:rPr>
+          <w:rFonts w:ascii="Consolas" w:hAnsi="Consolas"/>
+          <w:sz w:val="18"/>
+        </w:rPr>
+        <w:t>url_actualizacion = ""</w:t>
+      </w:r>
+      <w:r>
+        <w:t xml:space="preserve">. Volver a comprimir la carpeta </w:t>
+      </w:r>
+      <w:r>
+        <w:rPr>
+          <w:rFonts w:ascii="Consolas" w:hAnsi="Consolas"/>
+          <w:sz w:val="18"/>
+        </w:rPr>
+        <w:t>InformeRegional</w:t>
+      </w:r>
+      <w:r>
+        <w:t xml:space="preserve"> o regenerar el zip con </w:t>
+      </w:r>
+      <w:r>
+        <w:rPr>
+          <w:rFonts w:ascii="Consolas" w:hAnsi="Consolas"/>
+          <w:sz w:val="18"/>
+        </w:rPr>
+        <w:t>build_portable.py</w:t>
+      </w:r>
+      <w:r>
+        <w:t xml:space="preserve"> después de cambiar la plantilla </w:t>
+      </w:r>
+      <w:r>
+        <w:rPr>
+          <w:rFonts w:ascii="Consolas" w:hAnsi="Consolas"/>
+          <w:sz w:val="18"/>
+        </w:rPr>
+        <w:t>CONFIG</w:t>
+      </w:r>
+      <w:r>
+        <w:t>.</w:t>
+      </w:r>
+    </w:p>
+    <w:p>
+      <w:pPr>
+        <w:pStyle w:val="ListNumber"/>
+      </w:pPr>
+      <w:r>
+        <w:t xml:space="preserve">Subir el zip y el manual a </w:t>
+      </w:r>
+      <w:r>
+        <w:rPr>
+          <w:rFonts w:ascii="Consolas" w:hAnsi="Consolas"/>
+          <w:sz w:val="18"/>
+        </w:rPr>
+        <w:t>Tablero/</w:t>
+      </w:r>
+      <w:r>
+        <w:t xml:space="preserve">. Los usuarios lo descargan, lo descomprimen en una carpeta local (no en OneDrive ni en una unidad de red) y abren el </w:t>
+      </w:r>
+      <w:r>
+        <w:rPr>
+          <w:rFonts w:ascii="Consolas" w:hAnsi="Consolas"/>
+          <w:sz w:val="18"/>
+        </w:rPr>
+        <w:t>.bat</w:t>
+      </w:r>
+      <w:r>
+        <w:t>.</w:t>
+      </w:r>
+    </w:p>
+    <w:p>
+      <w:pPr>
+        <w:pStyle w:val="ListNumber"/>
+      </w:pPr>
+      <w:r>
+        <w:t xml:space="preserve">En el equipo del operador, </w:t>
+      </w:r>
+      <w:r>
+        <w:rPr>
+          <w:rFonts w:ascii="Consolas" w:hAnsi="Consolas"/>
+          <w:sz w:val="18"/>
+        </w:rPr>
+        <w:t>informe_regional.toml</w:t>
+      </w:r>
+      <w:r>
+        <w:t xml:space="preserve"> → </w:t>
+      </w:r>
+      <w:r>
+        <w:rPr>
+          <w:rFonts w:ascii="Consolas" w:hAnsi="Consolas"/>
+          <w:sz w:val="18"/>
+        </w:rPr>
+        <w:t>[publicacion] carpeta</w:t>
+      </w:r>
+      <w:r>
+        <w:t xml:space="preserve"> apunta a su copia sincronizada de </w:t>
+      </w:r>
+      <w:r>
+        <w:rPr>
+          <w:rFonts w:ascii="Consolas" w:hAnsi="Consolas"/>
+          <w:sz w:val="18"/>
+        </w:rPr>
+        <w:t>Datos/</w:t>
+      </w:r>
+      <w:r>
+        <w:t xml:space="preserve">. Cada mes </w:t>
+      </w:r>
+      <w:r>
+        <w:rPr>
+          <w:rFonts w:ascii="Consolas" w:hAnsi="Consolas"/>
+          <w:sz w:val="18"/>
+        </w:rPr>
+        <w:t>Actualizar datos.bat</w:t>
+      </w:r>
+      <w:r>
+        <w:t xml:space="preserve"> deja ahí la base nueva y todos los tableros la instalan al abrirse.</w:t>
+      </w:r>
+    </w:p>
+    <w:p>
+      <w:pPr>
+        <w:pStyle w:val="ListNumber"/>
+      </w:pPr>
+      <w:r>
+        <w:rPr>
+          <w:b/>
+        </w:rPr>
+        <w:t>Primer arranque en un equipo de la entidad:</w:t>
+      </w:r>
+      <w:r>
+        <w:t xml:space="preserve"> Windows marca los archivos descargados (SmartScreen: "Más información → Ejecutar de todas formas"). Si la política de la entidad bloquea </w:t>
+      </w:r>
+      <w:r>
+        <w:rPr>
+          <w:rFonts w:ascii="Consolas" w:hAnsi="Consolas"/>
+          <w:sz w:val="18"/>
+        </w:rPr>
+        <w:t>.bat</w:t>
+      </w:r>
+      <w:r>
+        <w:t xml:space="preserve"> o ejecutables sin firma, pedir a TI que permita la carpeta </w:t>
+      </w:r>
+      <w:r>
+        <w:rPr>
+          <w:rFonts w:ascii="Consolas" w:hAnsi="Consolas"/>
+          <w:sz w:val="18"/>
+        </w:rPr>
+        <w:t>InformeRegional</w:t>
+      </w:r>
+      <w:r>
+        <w:t xml:space="preserve"> (es Python oficial de python.org sin modificar; no requiere administrador). Probar en un equipo de la entidad antes de anunciarlo.</w:t>
+      </w:r>
+    </w:p>
+    <w:p>
+      <w:pPr>
+        <w:pStyle w:val="Heading3"/>
+      </w:pPr>
+      <w:r>
+        <w:t>8.3 Actualización de datos: protocolo</w:t>
+      </w:r>
+    </w:p>
+    <w:p>
+      <w:pPr>
+        <w:ind w:left="240"/>
+        <w:shd w:val="clear" w:fill="F4F6F7"/>
+      </w:pPr>
+      <w:r>
+        <w:rPr>
+          <w:rFonts w:ascii="Consolas" w:hAnsi="Consolas"/>
+          <w:sz w:val="17"/>
+        </w:rPr>
+        <w:t>operador                                  canal                              tablero del usuario</w:t>
         <w:br/>
       </w:r>
       <w:r>
@@ -15577,7 +16351,7 @@
           <w:rFonts w:ascii="Consolas" w:hAnsi="Consolas"/>
           <w:sz w:val="17"/>
         </w:rPr>
-        <w:t>tools/publicar_datos ──► datos-&lt;versión&gt;: base + manifest ──► al abrir: GET manifest.json</w:t>
+        <w:t>tools/publicar_datos ──► carpeta compartida (SharePoint/OneDrive) ──► al abrir: ¿versión mayor? copiar, verificar, instalar</w:t>
         <w:br/>
       </w:r>
       <w:r>
@@ -15585,32 +16359,42 @@
           <w:rFonts w:ascii="Consolas" w:hAnsi="Consolas"/>
           <w:sz w:val="17"/>
         </w:rPr>
-        <w:t xml:space="preserve">                                                              versión &gt; local ? GET base, SHA-256, instalar</w:t>
+        <w:t xml:space="preserve">                    └──► release GitHub datos-&lt;versión&gt;           ──► al abrir: GET manifest; ¿mayor? GET base, SHA-256, instalar</w:t>
       </w:r>
     </w:p>
     <w:p>
       <w:r>
-        <w:t>Si la red corporativa bloquea GitHub, se puede servir el mismo par de archivos desde cualquier URL (</w:t>
+        <w:t xml:space="preserve">La versión es </w:t>
       </w:r>
       <w:r>
         <w:rPr>
           <w:rFonts w:ascii="Consolas" w:hAnsi="Consolas"/>
           <w:sz w:val="18"/>
         </w:rPr>
-        <w:t>INFORME_RELEASE_URL</w:t>
-      </w:r>
-      <w:r>
-        <w:t xml:space="preserve">) o usar la carpeta </w:t>
+        <w:t>AAAA.MM.DD-HHMM</w:t>
+      </w:r>
+      <w:r>
+        <w:t>, así que "mayor" equivale a "más reciente". Cualquier servidor web que sirva los dos archivos en una URL fija sirve como canal B (</w:t>
       </w:r>
       <w:r>
         <w:rPr>
           <w:rFonts w:ascii="Consolas" w:hAnsi="Consolas"/>
           <w:sz w:val="18"/>
         </w:rPr>
+        <w:t>url_actualizacion</w:t>
+      </w:r>
+      <w:r>
+        <w:t xml:space="preserve">); la carpeta </w:t>
+      </w:r>
+      <w:r>
+        <w:rPr>
+          <w:rFonts w:ascii="Consolas" w:hAnsi="Consolas"/>
+          <w:sz w:val="18"/>
+        </w:rPr>
         <w:t>actualizacion/</w:t>
       </w:r>
       <w:r>
-        <w:t xml:space="preserve"> (USB, correo, SharePoint).</w:t>
+        <w:t xml:space="preserve"> del propio tablero queda como último recurso (USB, correo).</w:t>
       </w:r>
     </w:p>
     <w:p>
@@ -15993,7 +16777,568 @@
         <w:pStyle w:val="Heading3"/>
       </w:pPr>
       <w:r>
-        <w:t>9.3 Reproducir el sistema en otro escenario</w:t>
+        <w:t>9.3 Paquete de entrega e instalación desde el código fuente</w:t>
+      </w:r>
+    </w:p>
+    <w:p>
+      <w:r>
+        <w:t xml:space="preserve">El equipo de soporte recibe el sistema como paquete, no como acceso a un repositorio. </w:t>
+      </w:r>
+      <w:r>
+        <w:rPr>
+          <w:rFonts w:ascii="Consolas" w:hAnsi="Consolas"/>
+          <w:sz w:val="18"/>
+        </w:rPr>
+        <w:t>tools/build_entrega.py</w:t>
+      </w:r>
+      <w:r>
+        <w:t xml:space="preserve"> (tras </w:t>
+      </w:r>
+      <w:r>
+        <w:rPr>
+          <w:rFonts w:ascii="Consolas" w:hAnsi="Consolas"/>
+          <w:sz w:val="18"/>
+        </w:rPr>
+        <w:t>build_docs.py</w:t>
+      </w:r>
+      <w:r>
+        <w:t xml:space="preserve"> y </w:t>
+      </w:r>
+      <w:r>
+        <w:rPr>
+          <w:rFonts w:ascii="Consolas" w:hAnsi="Consolas"/>
+          <w:sz w:val="18"/>
+        </w:rPr>
+        <w:t>build_portable.py</w:t>
+      </w:r>
+      <w:r>
+        <w:t xml:space="preserve">, con todo confirmado en git) genera </w:t>
+      </w:r>
+      <w:r>
+        <w:rPr>
+          <w:rFonts w:ascii="Consolas" w:hAnsi="Consolas"/>
+          <w:sz w:val="18"/>
+        </w:rPr>
+        <w:t>dist/Entrega_&lt;fecha&gt;/</w:t>
+      </w:r>
+      <w:r>
+        <w:t>:</w:t>
+      </w:r>
+    </w:p>
+    <w:tbl>
+      <w:tblPr>
+        <w:tblStyle w:val="TableGrid"/>
+        <w:tblW w:type="auto" w:w="0"/>
+        <w:tblLook w:firstColumn="1" w:firstRow="1" w:lastColumn="0" w:lastRow="0" w:noHBand="0" w:noVBand="1" w:val="04A0"/>
+      </w:tblPr>
+      <w:tblGrid>
+        <w:gridCol w:w="4320"/>
+        <w:gridCol w:w="4320"/>
+      </w:tblGrid>
+      <w:tr>
+        <w:tc>
+          <w:tcPr>
+            <w:tcW w:type="dxa" w:w="4320"/>
+            <w:shd w:val="clear" w:fill="E0F2F1"/>
+          </w:tcPr>
+          <w:p>
+            <w:r>
+              <w:rPr>
+                <w:b/>
+                <w:sz w:val="18"/>
+              </w:rPr>
+            </w:r>
+            <w:r>
+              <w:rPr>
+                <w:b/>
+                <w:sz w:val="18"/>
+              </w:rPr>
+              <w:t>Archivo</w:t>
+            </w:r>
+          </w:p>
+        </w:tc>
+        <w:tc>
+          <w:tcPr>
+            <w:tcW w:type="dxa" w:w="4320"/>
+            <w:shd w:val="clear" w:fill="E0F2F1"/>
+          </w:tcPr>
+          <w:p>
+            <w:r>
+              <w:rPr>
+                <w:b/>
+                <w:sz w:val="18"/>
+              </w:rPr>
+            </w:r>
+            <w:r>
+              <w:rPr>
+                <w:b/>
+                <w:sz w:val="18"/>
+              </w:rPr>
+              <w:t>Contenido</w:t>
+            </w:r>
+          </w:p>
+        </w:tc>
+      </w:tr>
+      <w:tr>
+        <w:tc>
+          <w:tcPr>
+            <w:tcW w:type="dxa" w:w="4320"/>
+          </w:tcPr>
+          <w:p>
+            <w:r>
+              <w:rPr>
+                <w:sz w:val="18"/>
+              </w:rPr>
+            </w:r>
+            <w:r>
+              <w:rPr>
+                <w:rFonts w:ascii="Consolas" w:hAnsi="Consolas"/>
+                <w:sz w:val="18"/>
+              </w:rPr>
+              <w:t>codigo_fuente_&lt;fecha&gt;_&lt;commit&gt;.zip</w:t>
+            </w:r>
+          </w:p>
+        </w:tc>
+        <w:tc>
+          <w:tcPr>
+            <w:tcW w:type="dxa" w:w="4320"/>
+          </w:tcPr>
+          <w:p>
+            <w:r>
+              <w:rPr>
+                <w:sz w:val="18"/>
+              </w:rPr>
+            </w:r>
+            <w:r>
+              <w:rPr>
+                <w:sz w:val="18"/>
+              </w:rPr>
+              <w:t>El repositorio en ese commit (</w:t>
+            </w:r>
+            <w:r>
+              <w:rPr>
+                <w:rFonts w:ascii="Consolas" w:hAnsi="Consolas"/>
+                <w:sz w:val="18"/>
+              </w:rPr>
+              <w:t>git archive</w:t>
+            </w:r>
+            <w:r>
+              <w:rPr>
+                <w:sz w:val="18"/>
+              </w:rPr>
+              <w:t xml:space="preserve">): código, documentación, plantilla de configuración. Sin datos, sin </w:t>
+            </w:r>
+            <w:r>
+              <w:rPr>
+                <w:rFonts w:ascii="Consolas" w:hAnsi="Consolas"/>
+                <w:sz w:val="18"/>
+              </w:rPr>
+              <w:t>informe_regional.toml</w:t>
+            </w:r>
+            <w:r>
+              <w:rPr>
+                <w:sz w:val="18"/>
+              </w:rPr>
+              <w:t>, sin la maqueta del cliente</w:t>
+            </w:r>
+          </w:p>
+        </w:tc>
+      </w:tr>
+      <w:tr>
+        <w:tc>
+          <w:tcPr>
+            <w:tcW w:type="dxa" w:w="4320"/>
+          </w:tcPr>
+          <w:p>
+            <w:r>
+              <w:rPr>
+                <w:sz w:val="18"/>
+              </w:rPr>
+            </w:r>
+            <w:r>
+              <w:rPr>
+                <w:rFonts w:ascii="Consolas" w:hAnsi="Consolas"/>
+                <w:sz w:val="18"/>
+              </w:rPr>
+              <w:t>InformeRegional_&lt;versión&gt;.zip</w:t>
+            </w:r>
+          </w:p>
+        </w:tc>
+        <w:tc>
+          <w:tcPr>
+            <w:tcW w:type="dxa" w:w="4320"/>
+          </w:tcPr>
+          <w:p>
+            <w:r>
+              <w:rPr>
+                <w:sz w:val="18"/>
+              </w:rPr>
+            </w:r>
+            <w:r>
+              <w:rPr>
+                <w:sz w:val="18"/>
+              </w:rPr>
+              <w:t>Tablero portable para los usuarios</w:t>
+            </w:r>
+          </w:p>
+        </w:tc>
+      </w:tr>
+      <w:tr>
+        <w:tc>
+          <w:tcPr>
+            <w:tcW w:type="dxa" w:w="4320"/>
+          </w:tcPr>
+          <w:p>
+            <w:r>
+              <w:rPr>
+                <w:sz w:val="18"/>
+              </w:rPr>
+            </w:r>
+            <w:r>
+              <w:rPr>
+                <w:rFonts w:ascii="Consolas" w:hAnsi="Consolas"/>
+                <w:sz w:val="18"/>
+              </w:rPr>
+              <w:t>MANUAL_USUARIO.*</w:t>
+            </w:r>
+            <w:r>
+              <w:rPr>
+                <w:sz w:val="18"/>
+              </w:rPr>
+              <w:t xml:space="preserve">, </w:t>
+            </w:r>
+            <w:r>
+              <w:rPr>
+                <w:rFonts w:ascii="Consolas" w:hAnsi="Consolas"/>
+                <w:sz w:val="18"/>
+              </w:rPr>
+              <w:t>MANUAL_TECNICO.*</w:t>
+            </w:r>
+          </w:p>
+        </w:tc>
+        <w:tc>
+          <w:tcPr>
+            <w:tcW w:type="dxa" w:w="4320"/>
+          </w:tcPr>
+          <w:p>
+            <w:r>
+              <w:rPr>
+                <w:sz w:val="18"/>
+              </w:rPr>
+            </w:r>
+            <w:r>
+              <w:rPr>
+                <w:sz w:val="18"/>
+              </w:rPr>
+              <w:t>Manuales en Word y Markdown</w:t>
+            </w:r>
+          </w:p>
+        </w:tc>
+      </w:tr>
+      <w:tr>
+        <w:tc>
+          <w:tcPr>
+            <w:tcW w:type="dxa" w:w="4320"/>
+          </w:tcPr>
+          <w:p>
+            <w:r>
+              <w:rPr>
+                <w:sz w:val="18"/>
+              </w:rPr>
+            </w:r>
+            <w:r>
+              <w:rPr>
+                <w:rFonts w:ascii="Consolas" w:hAnsi="Consolas"/>
+                <w:sz w:val="18"/>
+              </w:rPr>
+              <w:t>datos_historicos_parquet_&lt;fecha&gt;.zip</w:t>
+            </w:r>
+          </w:p>
+        </w:tc>
+        <w:tc>
+          <w:tcPr>
+            <w:tcW w:type="dxa" w:w="4320"/>
+          </w:tcPr>
+          <w:p>
+            <w:r>
+              <w:rPr>
+                <w:sz w:val="18"/>
+              </w:rPr>
+            </w:r>
+            <w:r>
+              <w:rPr>
+                <w:rFonts w:ascii="Consolas" w:hAnsi="Consolas"/>
+                <w:sz w:val="18"/>
+              </w:rPr>
+              <w:t>data/parquet/</w:t>
+            </w:r>
+            <w:r>
+              <w:rPr>
+                <w:sz w:val="18"/>
+              </w:rPr>
+              <w:t xml:space="preserve">: todo lo descargado hasta la fecha. </w:t>
+            </w:r>
+            <w:r>
+              <w:rPr>
+                <w:b/>
+                <w:sz w:val="18"/>
+              </w:rPr>
+              <w:t>Conservarlo</w:t>
+            </w:r>
+            <w:r>
+              <w:rPr>
+                <w:sz w:val="18"/>
+              </w:rPr>
+              <w:t>: las fotos mensuales de BDUA, REPS y Supersalud no se pueden volver a descargar; el resto se regenera</w:t>
+            </w:r>
+          </w:p>
+        </w:tc>
+      </w:tr>
+      <w:tr>
+        <w:tc>
+          <w:tcPr>
+            <w:tcW w:type="dxa" w:w="4320"/>
+          </w:tcPr>
+          <w:p>
+            <w:r>
+              <w:rPr>
+                <w:sz w:val="18"/>
+              </w:rPr>
+            </w:r>
+            <w:r>
+              <w:rPr>
+                <w:rFonts w:ascii="Consolas" w:hAnsi="Consolas"/>
+                <w:sz w:val="18"/>
+              </w:rPr>
+              <w:t>LEEME_ENTREGA.txt</w:t>
+            </w:r>
+          </w:p>
+        </w:tc>
+        <w:tc>
+          <w:tcPr>
+            <w:tcW w:type="dxa" w:w="4320"/>
+          </w:tcPr>
+          <w:p>
+            <w:r>
+              <w:rPr>
+                <w:sz w:val="18"/>
+              </w:rPr>
+            </w:r>
+            <w:r>
+              <w:rPr>
+                <w:sz w:val="18"/>
+              </w:rPr>
+              <w:t>Contenido y primeros pasos</w:t>
+            </w:r>
+          </w:p>
+        </w:tc>
+      </w:tr>
+    </w:tbl>
+    <w:p/>
+    <w:p>
+      <w:r>
+        <w:rPr>
+          <w:b/>
+        </w:rPr>
+        <w:t>Instalación desde el zip de código</w:t>
+      </w:r>
+      <w:r>
+        <w:t xml:space="preserve"> (sin git):</w:t>
+      </w:r>
+    </w:p>
+    <w:p>
+      <w:pPr>
+        <w:pStyle w:val="ListNumber"/>
+      </w:pPr>
+      <w:r>
+        <w:t xml:space="preserve">Descomprimir </w:t>
+      </w:r>
+      <w:r>
+        <w:rPr>
+          <w:rFonts w:ascii="Consolas" w:hAnsi="Consolas"/>
+          <w:sz w:val="18"/>
+        </w:rPr>
+        <w:t>codigo_fuente_*.zip</w:t>
+      </w:r>
+      <w:r>
+        <w:t xml:space="preserve">; descomprimir </w:t>
+      </w:r>
+      <w:r>
+        <w:rPr>
+          <w:rFonts w:ascii="Consolas" w:hAnsi="Consolas"/>
+          <w:sz w:val="18"/>
+        </w:rPr>
+        <w:t>datos_historicos_parquet_*.zip</w:t>
+      </w:r>
+      <w:r>
+        <w:t xml:space="preserve"> dentro, en </w:t>
+      </w:r>
+      <w:r>
+        <w:rPr>
+          <w:rFonts w:ascii="Consolas" w:hAnsi="Consolas"/>
+          <w:sz w:val="18"/>
+        </w:rPr>
+        <w:t>data\parquet\</w:t>
+      </w:r>
+      <w:r>
+        <w:t>.</w:t>
+      </w:r>
+    </w:p>
+    <w:p>
+      <w:pPr>
+        <w:pStyle w:val="ListNumber"/>
+      </w:pPr>
+      <w:r>
+        <w:t xml:space="preserve">Python 3.12 + Chrome; </w:t>
+      </w:r>
+      <w:r>
+        <w:rPr>
+          <w:rFonts w:ascii="Consolas" w:hAnsi="Consolas"/>
+          <w:sz w:val="18"/>
+        </w:rPr>
+        <w:t>Preparar equipo.bat</w:t>
+      </w:r>
+      <w:r>
+        <w:t>.</w:t>
+      </w:r>
+    </w:p>
+    <w:p>
+      <w:pPr>
+        <w:pStyle w:val="ListNumber"/>
+      </w:pPr>
+      <w:r>
+        <w:rPr>
+          <w:rFonts w:ascii="Consolas" w:hAnsi="Consolas"/>
+          <w:sz w:val="18"/>
+        </w:rPr>
+        <w:t>informe_regional.example.toml</w:t>
+      </w:r>
+      <w:r>
+        <w:t xml:space="preserve"> → </w:t>
+      </w:r>
+      <w:r>
+        <w:rPr>
+          <w:rFonts w:ascii="Consolas" w:hAnsi="Consolas"/>
+          <w:sz w:val="18"/>
+        </w:rPr>
+        <w:t>informe_regional.toml</w:t>
+      </w:r>
+      <w:r>
+        <w:t xml:space="preserve">; fijar </w:t>
+      </w:r>
+      <w:r>
+        <w:rPr>
+          <w:rFonts w:ascii="Consolas" w:hAnsi="Consolas"/>
+          <w:sz w:val="18"/>
+        </w:rPr>
+        <w:t>[publicacion] carpeta</w:t>
+      </w:r>
+      <w:r>
+        <w:t xml:space="preserve"> (y/o </w:t>
+      </w:r>
+      <w:r>
+        <w:rPr>
+          <w:rFonts w:ascii="Consolas" w:hAnsi="Consolas"/>
+          <w:sz w:val="18"/>
+        </w:rPr>
+        <w:t>repo</w:t>
+      </w:r>
+      <w:r>
+        <w:t>).</w:t>
+      </w:r>
+    </w:p>
+    <w:p>
+      <w:pPr>
+        <w:pStyle w:val="ListNumber"/>
+      </w:pPr>
+      <w:r>
+        <w:rPr>
+          <w:rFonts w:ascii="Consolas" w:hAnsi="Consolas"/>
+          <w:sz w:val="18"/>
+        </w:rPr>
+        <w:t>python -m pipeline.runner --transform-only</w:t>
+      </w:r>
+      <w:r>
+        <w:t xml:space="preserve"> reconstruye la base desde los parquet; </w:t>
+      </w:r>
+      <w:r>
+        <w:rPr>
+          <w:rFonts w:ascii="Consolas" w:hAnsi="Consolas"/>
+          <w:sz w:val="18"/>
+        </w:rPr>
+        <w:t>streamlit run dashboard\app.py</w:t>
+      </w:r>
+      <w:r>
+        <w:t xml:space="preserve"> la muestra. A partir de ahí, el ciclo mensual (sección 4).</w:t>
+      </w:r>
+    </w:p>
+    <w:p>
+      <w:r>
+        <w:rPr>
+          <w:b/>
+        </w:rPr>
+        <w:t>Llevar el código al repositorio de la entidad</w:t>
+      </w:r>
+      <w:r>
+        <w:t xml:space="preserve"> (GitHub, GitLab, Azure DevOps): descomprimir el zip en un repositorio nuevo y confirmar. Si se publican los datos por release de GitHub, cambiar </w:t>
+      </w:r>
+      <w:r>
+        <w:rPr>
+          <w:rFonts w:ascii="Consolas" w:hAnsi="Consolas"/>
+          <w:sz w:val="18"/>
+        </w:rPr>
+        <w:t>[publicacion] repo</w:t>
+      </w:r>
+      <w:r>
+        <w:t xml:space="preserve"> en el operador y </w:t>
+      </w:r>
+      <w:r>
+        <w:rPr>
+          <w:rFonts w:ascii="Consolas" w:hAnsi="Consolas"/>
+          <w:sz w:val="18"/>
+        </w:rPr>
+        <w:t>url_actualizacion</w:t>
+      </w:r>
+      <w:r>
+        <w:t xml:space="preserve"> en la plantilla </w:t>
+      </w:r>
+      <w:r>
+        <w:rPr>
+          <w:rFonts w:ascii="Consolas" w:hAnsi="Consolas"/>
+          <w:sz w:val="18"/>
+        </w:rPr>
+        <w:t>CONFIG</w:t>
+      </w:r>
+      <w:r>
+        <w:t xml:space="preserve"> de </w:t>
+      </w:r>
+      <w:r>
+        <w:rPr>
+          <w:rFonts w:ascii="Consolas" w:hAnsi="Consolas"/>
+          <w:sz w:val="18"/>
+        </w:rPr>
+        <w:t>build_portable.py</w:t>
+      </w:r>
+      <w:r>
+        <w:t xml:space="preserve"> (y en el </w:t>
+      </w:r>
+      <w:r>
+        <w:rPr>
+          <w:rFonts w:ascii="Consolas" w:hAnsi="Consolas"/>
+          <w:sz w:val="18"/>
+        </w:rPr>
+        <w:t>app\informe_regional.toml</w:t>
+      </w:r>
+      <w:r>
+        <w:t xml:space="preserve"> de los tableros ya entregados). Si se publica por SharePoint, no hay nada que cambiar en el código.</w:t>
+      </w:r>
+    </w:p>
+    <w:p>
+      <w:pPr>
+        <w:pStyle w:val="Heading3"/>
+      </w:pPr>
+      <w:r>
+        <w:t>9.4 Reproducir el sistema en otro escenario</w:t>
       </w:r>
     </w:p>
     <w:p>
@@ -16102,7 +17447,7 @@
           <w:rFonts w:ascii="Consolas" w:hAnsi="Consolas"/>
           <w:sz w:val="18"/>
         </w:rPr>
-        <w:t>INFORME_RELEASE_URL</w:t>
+        <w:t>[tablero] url_actualizacion</w:t>
       </w:r>
       <w:r>
         <w:t xml:space="preserve">; el protocolo solo necesita un </w:t>
@@ -16115,7 +17460,7 @@
         <w:t>manifest.json</w:t>
       </w:r>
       <w:r>
-        <w:t xml:space="preserve"> y el archivo en una URL fija.</w:t>
+        <w:t xml:space="preserve"> y el archivo en una URL fija o en una carpeta compartida.</w:t>
       </w:r>
     </w:p>
     <w:p>
@@ -16167,7 +17512,7 @@
         <w:pStyle w:val="Heading3"/>
       </w:pPr>
       <w:r>
-        <w:t>9.4 Dependencias</w:t>
+        <w:t>9.5 Dependencias</w:t>
       </w:r>
     </w:p>
     <w:p>
@@ -16230,7 +17575,7 @@
         <w:pStyle w:val="Heading3"/>
       </w:pPr>
       <w:r>
-        <w:t>9.5 Datos personales y seguridad</w:t>
+        <w:t>9.6 Datos personales y seguridad</w:t>
       </w:r>
     </w:p>
     <w:p>
@@ -17318,7 +18663,7 @@
               <w:rPr>
                 <w:sz w:val="18"/>
               </w:rPr>
-              <w:t>Sin internet o GitHub bloqueado</w:t>
+              <w:t>Carpeta compartida sin sincronizar, sin internet o URL bloqueada</w:t>
             </w:r>
           </w:p>
         </w:tc>
@@ -17336,7 +18681,20 @@
               <w:rPr>
                 <w:sz w:val="18"/>
               </w:rPr>
-              <w:t>Actualización manual (8.2)</w:t>
+              <w:t xml:space="preserve">Ver el tooltip de la barra lateral; revisar </w:t>
+            </w:r>
+            <w:r>
+              <w:rPr>
+                <w:rFonts w:ascii="Consolas" w:hAnsi="Consolas"/>
+                <w:sz w:val="18"/>
+              </w:rPr>
+              <w:t>app\informe_regional.toml</w:t>
+            </w:r>
+            <w:r>
+              <w:rPr>
+                <w:sz w:val="18"/>
+              </w:rPr>
+              <w:t>; actualización manual (8.3)</w:t>
             </w:r>
           </w:p>
         </w:tc>
@@ -17584,6 +18942,21 @@
       </w:r>
       <w:r>
         <w:t xml:space="preserve"> — genera las versiones Word de los manuales.</w:t>
+      </w:r>
+    </w:p>
+    <w:p>
+      <w:pPr>
+        <w:pStyle w:val="ListBullet"/>
+      </w:pPr>
+      <w:r>
+        <w:rPr>
+          <w:rFonts w:ascii="Consolas" w:hAnsi="Consolas"/>
+          <w:sz w:val="18"/>
+        </w:rPr>
+        <w:t>tools/build_entrega.py</w:t>
+      </w:r>
+      <w:r>
+        <w:t xml:space="preserve"> — arma el paquete de entrega.</w:t>
       </w:r>
     </w:p>
     <w:sectPr>

</xml_diff>

<commit_message>
Wildcards in shared-folder paths: one setting fits every user and tenant
Co-Authored-By: Claude Fable 5.1 <noreply@anthropic.com>
</commit_message>
<xml_diff>
--- a/docs/MANUAL_TECNICO.docx
+++ b/docs/MANUAL_TECNICO.docx
@@ -2375,13 +2375,53 @@
         <w:t>""</w:t>
       </w:r>
       <w:r>
-        <w:t xml:space="preserve">) es un valor explícito y desactiva el canal; solo una clave ausente usa el valor por defecto. </w:t>
+        <w:t xml:space="preserve">) es un valor explícito y desactiva el canal; solo una clave ausente usa el valor por defecto. En las rutas, </w:t>
       </w:r>
       <w:r>
         <w:rPr>
           <w:rFonts w:ascii="Consolas" w:hAnsi="Consolas"/>
           <w:sz w:val="18"/>
         </w:rPr>
+        <w:t>~</w:t>
+      </w:r>
+      <w:r>
+        <w:t xml:space="preserve"> es la carpeta del usuario, </w:t>
+      </w:r>
+      <w:r>
+        <w:rPr>
+          <w:rFonts w:ascii="Consolas" w:hAnsi="Consolas"/>
+          <w:sz w:val="18"/>
+        </w:rPr>
+        <w:t>%VAR%</w:t>
+      </w:r>
+      <w:r>
+        <w:t xml:space="preserve"> una variable de entorno y </w:t>
+      </w:r>
+      <w:r>
+        <w:rPr>
+          <w:rFonts w:ascii="Consolas" w:hAnsi="Consolas"/>
+          <w:sz w:val="18"/>
+        </w:rPr>
+        <w:t>*</w:t>
+      </w:r>
+      <w:r>
+        <w:t xml:space="preserve"> vale por cualquier nombre de carpeta (se toma la primera que exista), de modo que </w:t>
+      </w:r>
+      <w:r>
+        <w:rPr>
+          <w:rFonts w:ascii="Consolas" w:hAnsi="Consolas"/>
+          <w:sz w:val="18"/>
+        </w:rPr>
+        <w:t>~/*/Informe Regional - Datos</w:t>
+      </w:r>
+      <w:r>
+        <w:t xml:space="preserve"> encuentra la biblioteca sincronizada sea cual sea el usuario y la organización. Las rutas relativas se resuelven contra la raíz del proyecto. </w:t>
+      </w:r>
+      <w:r>
+        <w:rPr>
+          <w:rFonts w:ascii="Consolas" w:hAnsi="Consolas"/>
+          <w:sz w:val="18"/>
+        </w:rPr>
         <w:t>manual_dir(fuente)</w:t>
       </w:r>
       <w:r>
@@ -2395,27 +2435,7 @@
         <w:t>&lt;manuales&gt;/&lt;fuente&gt;</w:t>
       </w:r>
       <w:r>
-        <w:t xml:space="preserve"> y crea la carpeta. Rutas relativas se resuelven contra la raíz del proyecto; se expanden </w:t>
-      </w:r>
-      <w:r>
-        <w:rPr>
-          <w:rFonts w:ascii="Consolas" w:hAnsi="Consolas"/>
-          <w:sz w:val="18"/>
-        </w:rPr>
-        <w:t>~</w:t>
-      </w:r>
-      <w:r>
-        <w:t xml:space="preserve"> y variables (</w:t>
-      </w:r>
-      <w:r>
-        <w:rPr>
-          <w:rFonts w:ascii="Consolas" w:hAnsi="Consolas"/>
-          <w:sz w:val="18"/>
-        </w:rPr>
-        <w:t>%OneDrive%</w:t>
-      </w:r>
-      <w:r>
-        <w:t>).</w:t>
+        <w:t xml:space="preserve"> y crea la carpeta.</w:t>
       </w:r>
     </w:p>
     <w:p>
@@ -16101,107 +16121,116 @@
         <w:rPr>
           <w:b/>
         </w:rPr>
-        <w:t>Antes de distribuir</w:t>
-      </w:r>
-      <w:r>
-        <w:t xml:space="preserve">, abrir </w:t>
+        <w:t>Nombres.</w:t>
+      </w:r>
+      <w:r>
+        <w:t xml:space="preserve"> Si el sitio se llama </w:t>
       </w:r>
       <w:r>
         <w:rPr>
           <w:rFonts w:ascii="Consolas" w:hAnsi="Consolas"/>
           <w:sz w:val="18"/>
         </w:rPr>
+        <w:t>Informe Regional</w:t>
+      </w:r>
+      <w:r>
+        <w:t xml:space="preserve"> y la biblioteca </w:t>
+      </w:r>
+      <w:r>
+        <w:rPr>
+          <w:rFonts w:ascii="Consolas" w:hAnsi="Consolas"/>
+          <w:sz w:val="18"/>
+        </w:rPr>
+        <w:t>Datos</w:t>
+      </w:r>
+      <w:r>
+        <w:t xml:space="preserve">, OneDrive la sincroniza en cada equipo como </w:t>
+      </w:r>
+      <w:r>
+        <w:rPr>
+          <w:rFonts w:ascii="Consolas" w:hAnsi="Consolas"/>
+          <w:sz w:val="18"/>
+        </w:rPr>
+        <w:t>C:\Users\&lt;usuario&gt;\&lt;Organización&gt;\Informe Regional - Datos</w:t>
+      </w:r>
+      <w:r>
+        <w:t xml:space="preserve">. El paquete ya trae </w:t>
+      </w:r>
+      <w:r>
+        <w:rPr>
+          <w:rFonts w:ascii="Consolas" w:hAnsi="Consolas"/>
+          <w:sz w:val="18"/>
+        </w:rPr>
+        <w:t>carpeta_actualizacion = "~/*/Informe Regional - Datos"</w:t>
+      </w:r>
+      <w:r>
+        <w:t xml:space="preserve"> (</w:t>
+      </w:r>
+      <w:r>
+        <w:rPr>
+          <w:rFonts w:ascii="Consolas" w:hAnsi="Consolas"/>
+          <w:sz w:val="18"/>
+        </w:rPr>
+        <w:t>~</w:t>
+      </w:r>
+      <w:r>
+        <w:t xml:space="preserve"> = carpeta del usuario, </w:t>
+      </w:r>
+      <w:r>
+        <w:rPr>
+          <w:rFonts w:ascii="Consolas" w:hAnsi="Consolas"/>
+          <w:sz w:val="18"/>
+        </w:rPr>
+        <w:t>*</w:t>
+      </w:r>
+      <w:r>
+        <w:t xml:space="preserve"> = cualquier nombre de organización), así que </w:t>
+      </w:r>
+      <w:r>
+        <w:rPr>
+          <w:b/>
+        </w:rPr>
+        <w:t>no hay que editar nada</w:t>
+      </w:r>
+      <w:r>
+        <w:t xml:space="preserve"> en los equipos de los usuarios. Con otros nombres, cambiar ese valor una vez en </w:t>
+      </w:r>
+      <w:r>
+        <w:rPr>
+          <w:rFonts w:ascii="Consolas" w:hAnsi="Consolas"/>
+          <w:sz w:val="18"/>
+        </w:rPr>
         <w:t>app\informe_regional.toml</w:t>
       </w:r>
       <w:r>
-        <w:t xml:space="preserve"> del paquete y escribir en </w:t>
+        <w:t xml:space="preserve"> (o en la plantilla </w:t>
       </w:r>
       <w:r>
         <w:rPr>
           <w:rFonts w:ascii="Consolas" w:hAnsi="Consolas"/>
           <w:sz w:val="18"/>
         </w:rPr>
-        <w:t>carpeta_actualizacion</w:t>
-      </w:r>
-      <w:r>
-        <w:t xml:space="preserve"> la ruta local con la que OneDrive sincroniza </w:t>
+        <w:t>CONFIG</w:t>
+      </w:r>
+      <w:r>
+        <w:t xml:space="preserve"> de </w:t>
       </w:r>
       <w:r>
         <w:rPr>
           <w:rFonts w:ascii="Consolas" w:hAnsi="Consolas"/>
           <w:sz w:val="18"/>
         </w:rPr>
-        <w:t>Datos/</w:t>
-      </w:r>
-      <w:r>
-        <w:t xml:space="preserve"> en los equipos de los usuarios (por ejemplo </w:t>
+        <w:t>build_portable.py</w:t>
+      </w:r>
+      <w:r>
+        <w:t xml:space="preserve"> y regenerar el zip). Si la entidad no usa GitHub, poner </w:t>
       </w:r>
       <w:r>
         <w:rPr>
           <w:rFonts w:ascii="Consolas" w:hAnsi="Consolas"/>
           <w:sz w:val="18"/>
         </w:rPr>
-        <w:t>C:/Users/&lt;usuario&gt;/&lt;Entidad&gt;/Informe Regional - Datos</w:t>
-      </w:r>
-      <w:r>
-        <w:t xml:space="preserve">; se admiten </w:t>
-      </w:r>
-      <w:r>
-        <w:rPr>
-          <w:rFonts w:ascii="Consolas" w:hAnsi="Consolas"/>
-          <w:sz w:val="18"/>
-        </w:rPr>
-        <w:t>~</w:t>
-      </w:r>
-      <w:r>
-        <w:t xml:space="preserve"> y variables como </w:t>
-      </w:r>
-      <w:r>
-        <w:rPr>
-          <w:rFonts w:ascii="Consolas" w:hAnsi="Consolas"/>
-          <w:sz w:val="18"/>
-        </w:rPr>
-        <w:t>%OneDrive%</w:t>
-      </w:r>
-      <w:r>
-        <w:t xml:space="preserve">). Si la entidad no usa GitHub, dejar </w:t>
-      </w:r>
-      <w:r>
-        <w:rPr>
-          <w:rFonts w:ascii="Consolas" w:hAnsi="Consolas"/>
-          <w:sz w:val="18"/>
-        </w:rPr>
         <w:t>url_actualizacion = ""</w:t>
-      </w:r>
-      <w:r>
-        <w:t xml:space="preserve">. Volver a comprimir la carpeta </w:t>
-      </w:r>
-      <w:r>
-        <w:rPr>
-          <w:rFonts w:ascii="Consolas" w:hAnsi="Consolas"/>
-          <w:sz w:val="18"/>
-        </w:rPr>
-        <w:t>InformeRegional</w:t>
-      </w:r>
-      <w:r>
-        <w:t xml:space="preserve"> o regenerar el zip con </w:t>
-      </w:r>
-      <w:r>
-        <w:rPr>
-          <w:rFonts w:ascii="Consolas" w:hAnsi="Consolas"/>
-          <w:sz w:val="18"/>
-        </w:rPr>
-        <w:t>build_portable.py</w:t>
-      </w:r>
-      <w:r>
-        <w:t xml:space="preserve"> después de cambiar la plantilla </w:t>
-      </w:r>
-      <w:r>
-        <w:rPr>
-          <w:rFonts w:ascii="Consolas" w:hAnsi="Consolas"/>
-          <w:sz w:val="18"/>
-        </w:rPr>
-        <w:t>CONFIG</w:t>
       </w:r>
       <w:r>
         <w:t>.</w:t>

</xml_diff>